<commit_message>
Prepare IJRC LASI spirometry submission package
</commit_message>
<xml_diff>
--- a/india-ageing-atlas/prism_lasi_2026/national_ref_equations_2026/LASI_RefEq_Cover_Letter.docx
+++ b/india-ageing-atlas/prism_lasi_2026/national_ref_equations_2026/LASI_RefEq_Cover_Letter.docx
@@ -53,7 +53,7 @@
         <w:t xml:space="preserve"> </w:t>
       </w:r>
       <w:r>
-        <w:t xml:space="preserve">[Target journal]</w:t>
+        <w:t xml:space="preserve">Indian Journal of Respiratory Care</w:t>
       </w:r>
     </w:p>
     <w:p>
@@ -79,7 +79,7 @@
           <w:b/>
           <w:bCs/>
         </w:rPr>
-        <w:t xml:space="preserve">“Nationally Representative Spirometry Reference Equations for Middle-Aged and Older Indians: Derivation and Validation from the Longitudinal Ageing Study in India”</w:t>
+        <w:t xml:space="preserve">“Nationally Representative Spirometry Reference Equations for Middle-Aged and Older Indians: A Cross-sectional Derivation and Validation Study from the Longitudinal Ageing Study in India”</w:t>
       </w:r>
     </w:p>
     <w:p>
@@ -111,7 +111,7 @@
         <w:pStyle w:val="BodyText"/>
       </w:pPr>
       <w:r>
-        <w:t xml:space="preserve">This manuscript addresses that gap directly. Using the Longitudinal Ageing Study in India (LASI)—the first nationally representative survey to perform spirometry in adults aged 45 years and older—I derive and internally validate national reference equations for FEV1, FVC, and FEV1/FVC from 24,300 respiratory-healthy adults, and provide them in a directly usable form (coefficients and a lookup table). I then show what they change: in the identical national sample, preserved ratio impaired spirometry (PRISm) prevalence falls from 46% under the race-neutral GLI-Global equations and 41% under the GLI module embedded in LASI, to about 12% under the home-grown reference—consistent with, and more nationally representative than, existing regional Indian equations.</w:t>
+        <w:t xml:space="preserve">This manuscript addresses that gap directly. Using the Longitudinal Ageing Study in India (LASI)—the first nationally representative survey to perform spirometry in adults aged 45 years and older—I derive and internally validate national reference equations for FEV1, FVC, and FEV1/FVC from 24,300 respiratory-healthy adults, and provide them in a directly usable form (coefficients and a lookup table). I then show what they change: in the identical national sample, preserved ratio impaired spirometry (PRISm) prevalence falls from 46.3% under the race-neutral GLI-Global equations and 40.6% under the GLI module embedded in LASI, to 13.8% by the fixed threshold and 4.0% by the LLN under the home-grown reference—consistent with, and more nationally representative than, existing regional Indian equations.</w:t>
       </w:r>
     </w:p>
     <w:p>

</xml_diff>